<commit_message>
feat: 作业6.2 - doc
</commit_message>
<xml_diff>
--- a/人形机器人综合实践课(2025年1期)/六、机器人运动学基础/doc/作业6.2.docx
+++ b/人形机器人综合实践课(2025年1期)/六、机器人运动学基础/doc/作业6.2.docx
@@ -3,6 +3,11 @@
 <w:document xmlns:wpc="http://schemas.microsoft.com/office/word/2010/wordprocessingCanvas" xmlns:cx="http://schemas.microsoft.com/office/drawing/2014/chartex" xmlns:cx1="http://schemas.microsoft.com/office/drawing/2015/9/8/chartex" xmlns:cx2="http://schemas.microsoft.com/office/drawing/2015/10/21/chartex" xmlns:cx3="http://schemas.microsoft.com/office/drawing/2016/5/9/chartex" xmlns:cx4="http://schemas.microsoft.com/office/drawing/2016/5/10/chartex" xmlns:cx5="http://schemas.microsoft.com/office/drawing/2016/5/11/chartex" xmlns:cx6="http://schemas.microsoft.com/office/drawing/2016/5/12/chartex" xmlns:cx7="http://schemas.microsoft.com/office/drawing/2016/5/13/chartex" xmlns:cx8="http://schemas.microsoft.com/office/drawing/2016/5/14/chartex" xmlns:mc="http://schemas.openxmlformats.org/markup-compatibility/2006" xmlns:aink="http://schemas.microsoft.com/office/drawing/2016/ink" xmlns:am3d="http://schemas.microsoft.com/office/drawing/2017/model3d" xmlns:o="urn:schemas-microsoft-com:office:office" xmlns:oel="http://schemas.microsoft.com/office/2019/extlst" xmlns:r="http://schemas.openxmlformats.org/officeDocument/2006/relationships" xmlns:m="http://schemas.openxmlformats.org/officeDocument/2006/math" xmlns:v="urn:schemas-microsoft-com:vml" xmlns:wp14="http://schemas.microsoft.com/office/word/2010/wordprocessingDrawing" xmlns:wp="http://schemas.openxmlformats.org/drawingml/2006/wordprocessingDrawing" xmlns:w10="urn:schemas-microsoft-com:office:word" xmlns:w="http://schemas.openxmlformats.org/wordprocessingml/2006/main" xmlns:w14="http://schemas.microsoft.com/office/word/2010/wordml" xmlns:w15="http://schemas.microsoft.com/office/word/2012/wordml" xmlns:w16cex="http://schemas.microsoft.com/office/word/2018/wordml/cex" xmlns:w16cid="http://schemas.microsoft.com/office/word/2016/wordml/cid" xmlns:w16="http://schemas.microsoft.com/office/word/2018/wordml" xmlns:w16du="http://schemas.microsoft.com/office/word/2023/wordml/word16du" xmlns:w16sdtdh="http://schemas.microsoft.com/office/word/2020/wordml/sdtdatahash" xmlns:w16sdtfl="http://schemas.microsoft.com/office/word/2024/wordml/sdtformatlock" xmlns:w16se="http://schemas.microsoft.com/office/word/2015/wordml/symex" xmlns:wpg="http://schemas.microsoft.com/office/word/2010/wordprocessingGroup" xmlns:wpi="http://schemas.microsoft.com/office/word/2010/wordprocessingInk" xmlns:wne="http://schemas.microsoft.com/office/word/2006/wordml" xmlns:wps="http://schemas.microsoft.com/office/word/2010/wordprocessingShape" mc:Ignorable="w14 w15 w16se w16cid w16 w16cex w16sdtdh w16sdtfl w16du wp14">
   <w:body>
     <w:p>
+      <w:pPr>
+        <w:rPr>
+          <w:rFonts w:hint="eastAsia"/>
+        </w:rPr>
+      </w:pPr>
       <w:r>
         <w:rPr>
           <w:b/>
@@ -14,6 +19,7 @@
     <w:p>
       <w:pPr>
         <w:rPr>
+          <w:rFonts w:hint="eastAsia"/>
           <w:b/>
           <w:bCs/>
         </w:rPr>
@@ -32,6 +38,9 @@
           <w:ilvl w:val="0"/>
           <w:numId w:val="1"/>
         </w:numPr>
+        <w:rPr>
+          <w:rFonts w:hint="eastAsia"/>
+        </w:rPr>
       </w:pPr>
       <w:r>
         <w:t>参考 arm_kinematics.py，编写一个支持右臂 FK 和 IK 的 Python 脚本</w:t>
@@ -43,6 +52,9 @@
           <w:ilvl w:val="0"/>
           <w:numId w:val="2"/>
         </w:numPr>
+        <w:rPr>
+          <w:rFonts w:hint="eastAsia"/>
+        </w:rPr>
       </w:pPr>
       <w:r>
         <w:t>查阅 URDF 确定右肩在 torso 坐标系中的位置，找出与左臂的参数差异</w:t>
@@ -54,6 +66,9 @@
           <w:ilvl w:val="0"/>
           <w:numId w:val="3"/>
         </w:numPr>
+        <w:rPr>
+          <w:rFonts w:hint="eastAsia"/>
+        </w:rPr>
       </w:pPr>
       <w:r>
         <w:t>用 tf_echo /torso /right_hand 验证脚本输出是否正确，提交测试结果</w:t>
@@ -62,6 +77,7 @@
     <w:p>
       <w:pPr>
         <w:rPr>
+          <w:rFonts w:hint="eastAsia"/>
           <w:b/>
           <w:bCs/>
         </w:rPr>
@@ -80,6 +96,9 @@
           <w:ilvl w:val="0"/>
           <w:numId w:val="5"/>
         </w:numPr>
+        <w:rPr>
+          <w:rFonts w:hint="eastAsia"/>
+        </w:rPr>
       </w:pPr>
       <w:r>
         <w:t>阅读《机器人学导论》第二章关于空间描述与变换的内容</w:t>
@@ -91,6 +110,9 @@
           <w:ilvl w:val="0"/>
           <w:numId w:val="6"/>
         </w:numPr>
+        <w:rPr>
+          <w:rFonts w:hint="eastAsia"/>
+        </w:rPr>
       </w:pPr>
       <w:r>
         <w:t>编写一个 Python 程序，实现以下四种转换功能：</w:t>
@@ -102,6 +124,9 @@
           <w:ilvl w:val="1"/>
           <w:numId w:val="4"/>
         </w:numPr>
+        <w:rPr>
+          <w:rFonts w:hint="eastAsia"/>
+        </w:rPr>
       </w:pPr>
       <w:r>
         <w:t>旋转矩阵 → RPY 欧拉角</w:t>
@@ -113,6 +138,9 @@
           <w:ilvl w:val="1"/>
           <w:numId w:val="4"/>
         </w:numPr>
+        <w:rPr>
+          <w:rFonts w:hint="eastAsia"/>
+        </w:rPr>
       </w:pPr>
       <w:r>
         <w:t>旋转矩阵 → 四元数</w:t>
@@ -124,6 +152,9 @@
           <w:ilvl w:val="1"/>
           <w:numId w:val="4"/>
         </w:numPr>
+        <w:rPr>
+          <w:rFonts w:hint="eastAsia"/>
+        </w:rPr>
       </w:pPr>
       <w:r>
         <w:t>RPY 欧拉角 → 旋转矩阵</w:t>
@@ -135,6 +166,9 @@
           <w:ilvl w:val="1"/>
           <w:numId w:val="4"/>
         </w:numPr>
+        <w:rPr>
+          <w:rFonts w:hint="eastAsia"/>
+        </w:rPr>
       </w:pPr>
       <w:r>
         <w:t>四元数 → 旋转矩阵</w:t>
@@ -146,6 +180,9 @@
           <w:ilvl w:val="0"/>
           <w:numId w:val="7"/>
         </w:numPr>
+        <w:rPr>
+          <w:rFonts w:hint="eastAsia"/>
+        </w:rPr>
       </w:pPr>
       <w:r>
         <w:t>用 tf_echo 输出中的 Rotation（同时提供了四元数和 RPY）作为测试数据，验证你的转换程序是否正确</w:t>
@@ -154,6 +191,7 @@
     <w:p>
       <w:pPr>
         <w:rPr>
+          <w:rFonts w:hint="eastAsia"/>
           <w:b/>
           <w:bCs/>
         </w:rPr>
@@ -172,6 +210,9 @@
           <w:ilvl w:val="0"/>
           <w:numId w:val="8"/>
         </w:numPr>
+        <w:rPr>
+          <w:rFonts w:hint="eastAsia"/>
+        </w:rPr>
       </w:pPr>
       <w:r>
         <w:t>编写 Python 脚本，遍历关节限位范围内的 q1、q2 组合（各取 100 个等间距值），用 FK 公式计算末端坐标，用 matplotlib 绘制 s-d 平面散点图</w:t>
@@ -183,6 +224,9 @@
           <w:ilvl w:val="0"/>
           <w:numId w:val="9"/>
         </w:numPr>
+        <w:rPr>
+          <w:rFonts w:hint="eastAsia"/>
+        </w:rPr>
       </w:pPr>
       <w:r>
         <w:t>在图中标注最大可达距离和最小可达距离的圆弧</w:t>
@@ -194,12 +238,20 @@
           <w:ilvl w:val="0"/>
           <w:numId w:val="10"/>
         </w:numPr>
+        <w:rPr>
+          <w:rFonts w:hint="eastAsia"/>
+        </w:rPr>
       </w:pPr>
       <w:r>
         <w:t>分析为什么可达区域不是一个完整的圆环，提交思考结果</w:t>
       </w:r>
     </w:p>
     <w:p>
+      <w:pPr>
+        <w:rPr>
+          <w:rFonts w:hint="eastAsia"/>
+        </w:rPr>
+      </w:pPr>
       <w:r>
         <w:br/>
       </w:r>
@@ -207,6 +259,7 @@
     <w:p>
       <w:pPr>
         <w:rPr>
+          <w:rFonts w:hint="eastAsia"/>
           <w:b/>
           <w:bCs/>
         </w:rPr>
@@ -220,6 +273,11 @@
       </w:r>
     </w:p>
     <w:p>
+      <w:pPr>
+        <w:rPr>
+          <w:rFonts w:hint="eastAsia"/>
+        </w:rPr>
+      </w:pPr>
       <w:r>
         <w:t>将以上内容整理为 </w:t>
       </w:r>
@@ -240,6 +298,9 @@
           <w:ilvl w:val="0"/>
           <w:numId w:val="11"/>
         </w:numPr>
+        <w:rPr>
+          <w:rFonts w:hint="eastAsia"/>
+        </w:rPr>
       </w:pPr>
       <w:r>
         <w:t>右臂脚本完整代码 + 与 tf_echo 的对比验证截图</w:t>
@@ -251,6 +312,9 @@
           <w:ilvl w:val="0"/>
           <w:numId w:val="12"/>
         </w:numPr>
+        <w:rPr>
+          <w:rFonts w:hint="eastAsia"/>
+        </w:rPr>
       </w:pPr>
       <w:r>
         <w:t>旋转转换脚本完整代码 + 用 tf_echo 数据验证的运行结果截图</w:t>
@@ -262,6 +326,9 @@
           <w:ilvl w:val="0"/>
           <w:numId w:val="13"/>
         </w:numPr>
+        <w:rPr>
+          <w:rFonts w:hint="eastAsia"/>
+        </w:rPr>
       </w:pPr>
       <w:r>
         <w:t>工作空间可视化脚本完整代码 + 生成的工作空间图片</w:t>
@@ -273,12 +340,21 @@
           <w:ilvl w:val="0"/>
           <w:numId w:val="14"/>
         </w:numPr>
+        <w:rPr>
+          <w:rFonts w:hint="eastAsia"/>
+        </w:rPr>
       </w:pPr>
       <w:r>
         <w:t>各题思考分析</w:t>
       </w:r>
     </w:p>
-    <w:p/>
+    <w:p>
+      <w:pPr>
+        <w:rPr>
+          <w:rFonts w:hint="eastAsia"/>
+        </w:rPr>
+      </w:pPr>
+    </w:p>
     <w:p>
       <w:pPr>
         <w:rPr>
@@ -305,6 +381,7 @@
     <w:p>
       <w:pPr>
         <w:rPr>
+          <w:rFonts w:hint="eastAsia"/>
           <w:b/>
           <w:bCs/>
         </w:rPr>
@@ -318,23 +395,35 @@
       </w:r>
     </w:p>
     <w:p>
-      <w:pPr>
-        <w:rPr>
-          <w:rFonts w:hint="eastAsia"/>
-        </w:rPr>
-      </w:pPr>
       <w:r>
         <w:rPr>
           <w:rFonts w:hint="eastAsia"/>
         </w:rPr>
         <w:t>（1）参见</w:t>
       </w:r>
-      <w:r>
-        <w:rPr>
-          <w:rFonts w:hint="eastAsia"/>
-        </w:rPr>
-        <w:t>arm_kinematics_plus.py</w:t>
-      </w:r>
+      <w:hyperlink r:id="rId5" w:history="1">
+        <w:r>
+          <w:rPr>
+            <w:rStyle w:val="ae"/>
+            <w:rFonts w:hint="eastAsia"/>
+          </w:rPr>
+          <w:t>arm_kinemati</w:t>
+        </w:r>
+        <w:r>
+          <w:rPr>
+            <w:rStyle w:val="ae"/>
+            <w:rFonts w:hint="eastAsia"/>
+          </w:rPr>
+          <w:t>c</w:t>
+        </w:r>
+        <w:r>
+          <w:rPr>
+            <w:rStyle w:val="ae"/>
+            <w:rFonts w:hint="eastAsia"/>
+          </w:rPr>
+          <w:t>s_plus.py</w:t>
+        </w:r>
+      </w:hyperlink>
       <w:r>
         <w:rPr>
           <w:rFonts w:hint="eastAsia"/>
@@ -349,6 +438,24 @@
       </w:r>
     </w:p>
     <w:p>
+      <w:pPr>
+        <w:rPr>
+          <w:rFonts w:hint="eastAsia"/>
+        </w:rPr>
+      </w:pPr>
+      <w:r>
+        <w:rPr>
+          <w:rFonts w:hint="eastAsia"/>
+        </w:rPr>
+        <w:t>https://github.com/acodeur/robot-course-practice/blob/main/人形机器人综合实践课(2025年1期)/六、机器人运动学基础/作业6.1/workspace/src/humanoid_sim/scripts/arm_kinematics_plus.py</w:t>
+      </w:r>
+    </w:p>
+    <w:p>
+      <w:pPr>
+        <w:rPr>
+          <w:rFonts w:hint="eastAsia"/>
+        </w:rPr>
+      </w:pPr>
       <w:r>
         <w:rPr>
           <w:rFonts w:hint="eastAsia"/>
@@ -1198,6 +1305,11 @@
       </w:r>
     </w:p>
     <w:p>
+      <w:pPr>
+        <w:rPr>
+          <w:rFonts w:hint="eastAsia"/>
+        </w:rPr>
+      </w:pPr>
       <w:r>
         <w:rPr>
           <w:noProof/>
@@ -1218,7 +1330,7 @@
                     <pic:cNvPicPr/>
                   </pic:nvPicPr>
                   <pic:blipFill>
-                    <a:blip r:embed="rId5"/>
+                    <a:blip r:embed="rId6"/>
                     <a:stretch>
                       <a:fillRect/>
                     </a:stretch>
@@ -1240,6 +1352,11 @@
       </w:r>
     </w:p>
     <w:p>
+      <w:pPr>
+        <w:rPr>
+          <w:rFonts w:hint="eastAsia"/>
+        </w:rPr>
+      </w:pPr>
       <w:r>
         <w:rPr>
           <w:rFonts w:hint="eastAsia"/>
@@ -1276,7 +1393,7 @@
                     <pic:cNvPicPr/>
                   </pic:nvPicPr>
                   <pic:blipFill>
-                    <a:blip r:embed="rId6"/>
+                    <a:blip r:embed="rId7"/>
                     <a:stretch>
                       <a:fillRect/>
                     </a:stretch>
@@ -1317,7 +1434,7 @@
                     <pic:cNvPicPr/>
                   </pic:nvPicPr>
                   <pic:blipFill>
-                    <a:blip r:embed="rId7"/>
+                    <a:blip r:embed="rId8"/>
                     <a:stretch>
                       <a:fillRect/>
                     </a:stretch>
@@ -1341,6 +1458,7 @@
     <w:p>
       <w:pPr>
         <w:rPr>
+          <w:rFonts w:hint="eastAsia"/>
           <w:b/>
           <w:bCs/>
         </w:rPr>
@@ -1353,10 +1471,185 @@
         <w:t>2.2 旋转表示相互转换</w:t>
       </w:r>
     </w:p>
-    <w:p/>
-    <w:p>
-      <w:pPr>
-        <w:rPr>
+    <w:p>
+      <w:r>
+        <w:rPr>
+          <w:rFonts w:hint="eastAsia"/>
+        </w:rPr>
+        <w:t>（1）程序参见</w:t>
+      </w:r>
+      <w:hyperlink r:id="rId9" w:history="1">
+        <w:r>
+          <w:rPr>
+            <w:rStyle w:val="ae"/>
+            <w:rFonts w:hint="eastAsia"/>
+          </w:rPr>
+          <w:t>spatial_tran</w:t>
+        </w:r>
+        <w:r>
+          <w:rPr>
+            <w:rStyle w:val="ae"/>
+            <w:rFonts w:hint="eastAsia"/>
+          </w:rPr>
+          <w:t>s</w:t>
+        </w:r>
+        <w:r>
+          <w:rPr>
+            <w:rStyle w:val="ae"/>
+            <w:rFonts w:hint="eastAsia"/>
+          </w:rPr>
+          <w:t>form.py</w:t>
+        </w:r>
+      </w:hyperlink>
+    </w:p>
+    <w:p>
+      <w:pPr>
+        <w:rPr>
+          <w:rFonts w:hint="eastAsia"/>
+        </w:rPr>
+      </w:pPr>
+      <w:r>
+        <w:rPr>
+          <w:rFonts w:hint="eastAsia"/>
+        </w:rPr>
+        <w:t>https://github.com/acodeur/robot-course-practice/blob/main/人形机器人综合实践课(2025年1期)/六、机器人运动学基础/作业6.2/spatial_transform.py</w:t>
+      </w:r>
+    </w:p>
+    <w:p>
+      <w:r>
+        <w:rPr>
+          <w:rFonts w:hint="eastAsia"/>
+        </w:rPr>
+        <w:t>（2）</w:t>
+      </w:r>
+      <w:r>
+        <w:rPr>
+          <w:rFonts w:hint="eastAsia"/>
+        </w:rPr>
+        <w:t>验证</w:t>
+      </w:r>
+    </w:p>
+    <w:p>
+      <w:pPr>
+        <w:rPr>
+          <w:rFonts w:hint="eastAsia"/>
+        </w:rPr>
+      </w:pPr>
+      <w:r>
+        <w:rPr>
+          <w:rFonts w:hint="eastAsia"/>
+        </w:rPr>
+        <w:t>使用如下</w:t>
+      </w:r>
+      <w:r>
+        <w:t>tf_echo 输出的 Rotation</w:t>
+      </w:r>
+    </w:p>
+    <w:p>
+      <w:pPr>
+        <w:jc w:val="center"/>
+      </w:pPr>
+      <w:r>
+        <w:rPr>
+          <w:noProof/>
+        </w:rPr>
+        <w:drawing>
+          <wp:inline distT="0" distB="0" distL="0" distR="0" wp14:anchorId="011BD82E" wp14:editId="2437E482">
+            <wp:extent cx="4032281" cy="1050927"/>
+            <wp:effectExtent l="0" t="0" r="6350" b="0"/>
+            <wp:docPr id="869084688" name="图片 1"/>
+            <wp:cNvGraphicFramePr>
+              <a:graphicFrameLocks xmlns:a="http://schemas.openxmlformats.org/drawingml/2006/main" noChangeAspect="1"/>
+            </wp:cNvGraphicFramePr>
+            <a:graphic xmlns:a="http://schemas.openxmlformats.org/drawingml/2006/main">
+              <a:graphicData uri="http://schemas.openxmlformats.org/drawingml/2006/picture">
+                <pic:pic xmlns:pic="http://schemas.openxmlformats.org/drawingml/2006/picture">
+                  <pic:nvPicPr>
+                    <pic:cNvPr id="869084688" name=""/>
+                    <pic:cNvPicPr/>
+                  </pic:nvPicPr>
+                  <pic:blipFill>
+                    <a:blip r:embed="rId10"/>
+                    <a:stretch>
+                      <a:fillRect/>
+                    </a:stretch>
+                  </pic:blipFill>
+                  <pic:spPr>
+                    <a:xfrm>
+                      <a:off x="0" y="0"/>
+                      <a:ext cx="4037104" cy="1052184"/>
+                    </a:xfrm>
+                    <a:prstGeom prst="rect">
+                      <a:avLst/>
+                    </a:prstGeom>
+                  </pic:spPr>
+                </pic:pic>
+              </a:graphicData>
+            </a:graphic>
+          </wp:inline>
+        </w:drawing>
+      </w:r>
+    </w:p>
+    <w:p>
+      <w:r>
+        <w:rPr>
+          <w:rFonts w:hint="eastAsia"/>
+        </w:rPr>
+        <w:t>验证如下并通过。</w:t>
+      </w:r>
+    </w:p>
+    <w:p>
+      <w:pPr>
+        <w:rPr>
+          <w:rFonts w:hint="eastAsia"/>
+        </w:rPr>
+      </w:pPr>
+      <w:r>
+        <w:rPr>
+          <w:noProof/>
+        </w:rPr>
+        <w:lastRenderedPageBreak/>
+        <w:drawing>
+          <wp:inline distT="0" distB="0" distL="0" distR="0" wp14:anchorId="20E8E573" wp14:editId="2F6B0B52">
+            <wp:extent cx="5274310" cy="2295525"/>
+            <wp:effectExtent l="0" t="0" r="2540" b="9525"/>
+            <wp:docPr id="1321067429" name="图片 1"/>
+            <wp:cNvGraphicFramePr>
+              <a:graphicFrameLocks xmlns:a="http://schemas.openxmlformats.org/drawingml/2006/main" noChangeAspect="1"/>
+            </wp:cNvGraphicFramePr>
+            <a:graphic xmlns:a="http://schemas.openxmlformats.org/drawingml/2006/main">
+              <a:graphicData uri="http://schemas.openxmlformats.org/drawingml/2006/picture">
+                <pic:pic xmlns:pic="http://schemas.openxmlformats.org/drawingml/2006/picture">
+                  <pic:nvPicPr>
+                    <pic:cNvPr id="1321067429" name=""/>
+                    <pic:cNvPicPr/>
+                  </pic:nvPicPr>
+                  <pic:blipFill>
+                    <a:blip r:embed="rId11"/>
+                    <a:stretch>
+                      <a:fillRect/>
+                    </a:stretch>
+                  </pic:blipFill>
+                  <pic:spPr>
+                    <a:xfrm>
+                      <a:off x="0" y="0"/>
+                      <a:ext cx="5274310" cy="2295525"/>
+                    </a:xfrm>
+                    <a:prstGeom prst="rect">
+                      <a:avLst/>
+                    </a:prstGeom>
+                  </pic:spPr>
+                </pic:pic>
+              </a:graphicData>
+            </a:graphic>
+          </wp:inline>
+        </w:drawing>
+      </w:r>
+    </w:p>
+    <w:p>
+      <w:pPr>
+        <w:rPr>
+          <w:rFonts w:hint="eastAsia"/>
           <w:b/>
           <w:bCs/>
         </w:rPr>
@@ -1370,11 +1663,189 @@
       </w:r>
     </w:p>
     <w:p>
-      <w:pPr>
-        <w:rPr>
-          <w:rFonts w:hint="eastAsia"/>
-        </w:rPr>
-      </w:pPr>
+      <w:r>
+        <w:rPr>
+          <w:rFonts w:hint="eastAsia"/>
+        </w:rPr>
+        <w:t>（1）程序参见</w:t>
+      </w:r>
+      <w:hyperlink r:id="rId12" w:history="1">
+        <w:r>
+          <w:rPr>
+            <w:rStyle w:val="ae"/>
+            <w:rFonts w:hint="eastAsia"/>
+          </w:rPr>
+          <w:t>reachable_area_viz.py</w:t>
+        </w:r>
+      </w:hyperlink>
+    </w:p>
+    <w:p>
+      <w:r>
+        <w:rPr>
+          <w:rFonts w:hint="eastAsia"/>
+        </w:rPr>
+        <w:t>https://github.com/acodeur/robot-course-practice/blob/main/人形机器人综合实践课(2025年1期)/六、机器人运动学基础/作业6.2/reachable_area_viz.py</w:t>
+      </w:r>
+    </w:p>
+    <w:p>
+      <w:r>
+        <w:rPr>
+          <w:rFonts w:hint="eastAsia"/>
+        </w:rPr>
+        <w:t>（2）生成图片</w:t>
+      </w:r>
+    </w:p>
+    <w:p>
+      <w:pPr>
+        <w:jc w:val="center"/>
+      </w:pPr>
+      <w:r>
+        <w:rPr>
+          <w:noProof/>
+        </w:rPr>
+        <w:drawing>
+          <wp:inline distT="0" distB="0" distL="0" distR="0" wp14:anchorId="6A1A90A5" wp14:editId="14E4E50A">
+            <wp:extent cx="3229953" cy="3229953"/>
+            <wp:effectExtent l="0" t="0" r="8890" b="8890"/>
+            <wp:docPr id="1267467413" name="图片 1"/>
+            <wp:cNvGraphicFramePr>
+              <a:graphicFrameLocks xmlns:a="http://schemas.openxmlformats.org/drawingml/2006/main" noChangeAspect="1"/>
+            </wp:cNvGraphicFramePr>
+            <a:graphic xmlns:a="http://schemas.openxmlformats.org/drawingml/2006/main">
+              <a:graphicData uri="http://schemas.openxmlformats.org/drawingml/2006/picture">
+                <pic:pic xmlns:pic="http://schemas.openxmlformats.org/drawingml/2006/picture">
+                  <pic:nvPicPr>
+                    <pic:cNvPr id="0" name="Picture 1"/>
+                    <pic:cNvPicPr>
+                      <a:picLocks noChangeAspect="1" noChangeArrowheads="1"/>
+                    </pic:cNvPicPr>
+                  </pic:nvPicPr>
+                  <pic:blipFill>
+                    <a:blip r:embed="rId13" cstate="print">
+                      <a:extLst>
+                        <a:ext uri="{28A0092B-C50C-407E-A947-70E740481C1C}">
+                          <a14:useLocalDpi xmlns:a14="http://schemas.microsoft.com/office/drawing/2010/main" val="0"/>
+                        </a:ext>
+                      </a:extLst>
+                    </a:blip>
+                    <a:srcRect/>
+                    <a:stretch>
+                      <a:fillRect/>
+                    </a:stretch>
+                  </pic:blipFill>
+                  <pic:spPr bwMode="auto">
+                    <a:xfrm>
+                      <a:off x="0" y="0"/>
+                      <a:ext cx="3235759" cy="3235759"/>
+                    </a:xfrm>
+                    <a:prstGeom prst="rect">
+                      <a:avLst/>
+                    </a:prstGeom>
+                    <a:noFill/>
+                    <a:ln>
+                      <a:noFill/>
+                    </a:ln>
+                  </pic:spPr>
+                </pic:pic>
+              </a:graphicData>
+            </a:graphic>
+          </wp:inline>
+        </w:drawing>
+      </w:r>
+    </w:p>
+    <w:p>
+      <w:pPr>
+        <w:rPr>
+          <w:rFonts w:hint="eastAsia"/>
+        </w:rPr>
+      </w:pPr>
+      <w:r>
+        <w:rPr>
+          <w:rFonts w:hint="eastAsia"/>
+        </w:rPr>
+        <w:t>（3）</w:t>
+      </w:r>
+      <w:r>
+        <w:t>手臂可达区域</w:t>
+      </w:r>
+      <w:r>
+        <w:rPr>
+          <w:rFonts w:hint="eastAsia"/>
+        </w:rPr>
+        <w:t>并</w:t>
+      </w:r>
+      <w:r>
+        <w:t>不是一个完整的圆环</w:t>
+      </w:r>
+      <w:r>
+        <w:rPr>
+          <w:rFonts w:hint="eastAsia"/>
+        </w:rPr>
+        <w:t>是因为q1和q2都有限定的弧度范围：肩关节q1</w:t>
+      </w:r>
+      <w:r>
+        <w:rPr>
+          <w:rFonts w:hint="eastAsia"/>
+        </w:rPr>
+        <w:t>限定在[-</w:t>
+      </w:r>
+      <w:r>
+        <w:t>1.57</w:t>
+      </w:r>
+      <w:r>
+        <w:rPr>
+          <w:rFonts w:hint="eastAsia"/>
+        </w:rPr>
+        <w:t>, 1.57]内，</w:t>
+      </w:r>
+      <w:r>
+        <w:rPr>
+          <w:rFonts w:hint="eastAsia"/>
+        </w:rPr>
+        <w:t>末端只能扫半个平面，无法到达后方；肘关节q2</w:t>
+      </w:r>
+      <w:r>
+        <w:t>限定在</w:t>
+      </w:r>
+      <w:r>
+        <w:t xml:space="preserve"> </w:t>
+      </w:r>
+      <w:r>
+        <w:t>[-2.0, 0.0]</w:t>
+      </w:r>
+      <w:r>
+        <w:rPr>
+          <w:rFonts w:hint="eastAsia"/>
+        </w:rPr>
+        <w:t>内，</w:t>
+      </w:r>
+      <w:r>
+        <w:t>只能向负方向（下垂）</w:t>
+      </w:r>
+      <w:r>
+        <w:rPr>
+          <w:rFonts w:hint="eastAsia"/>
+        </w:rPr>
+        <w:t>运动。</w:t>
+      </w:r>
+      <w:r>
+        <w:rPr>
+          <w:rFonts w:hint="eastAsia"/>
+        </w:rPr>
+        <w:t>若</w:t>
+      </w:r>
+      <w:r>
+        <w:rPr>
+          <w:rFonts w:hint="eastAsia"/>
+        </w:rPr>
+        <w:t>q1和q2</w:t>
+      </w:r>
+      <w:r>
+        <w:rPr>
+          <w:rFonts w:hint="eastAsia"/>
+        </w:rPr>
+        <w:t>无限制，则可达区域可以是一个完整的圆环。</w:t>
+      </w:r>
     </w:p>
     <w:sectPr>
       <w:pgSz w:w="11906" w:h="16838"/>
@@ -3033,6 +3504,41 @@
       <w:spacing w:val="5"/>
     </w:rPr>
   </w:style>
+  <w:style w:type="character" w:styleId="ae">
+    <w:name w:val="Hyperlink"/>
+    <w:basedOn w:val="a0"/>
+    <w:uiPriority w:val="99"/>
+    <w:unhideWhenUsed/>
+    <w:rsid w:val="00053589"/>
+    <w:rPr>
+      <w:color w:val="467886" w:themeColor="hyperlink"/>
+      <w:u w:val="single"/>
+    </w:rPr>
+  </w:style>
+  <w:style w:type="character" w:styleId="af">
+    <w:name w:val="Unresolved Mention"/>
+    <w:basedOn w:val="a0"/>
+    <w:uiPriority w:val="99"/>
+    <w:semiHidden/>
+    <w:unhideWhenUsed/>
+    <w:rsid w:val="00053589"/>
+    <w:rPr>
+      <w:color w:val="605E5C"/>
+      <w:shd w:val="clear" w:color="auto" w:fill="E1DFDD"/>
+    </w:rPr>
+  </w:style>
+  <w:style w:type="character" w:styleId="af0">
+    <w:name w:val="FollowedHyperlink"/>
+    <w:basedOn w:val="a0"/>
+    <w:uiPriority w:val="99"/>
+    <w:semiHidden/>
+    <w:unhideWhenUsed/>
+    <w:rsid w:val="002F1577"/>
+    <w:rPr>
+      <w:color w:val="96607D" w:themeColor="followedHyperlink"/>
+      <w:u w:val="single"/>
+    </w:rPr>
+  </w:style>
 </w:styles>
 </file>
 

</xml_diff>